<commit_message>
Implement core validation rules for v1
</commit_message>
<xml_diff>
--- a/docs/CheckMate Development Roadmap.docx
+++ b/docs/CheckMate Development Roadmap.docx
@@ -18,6 +18,7 @@
           <w14:ligatures w14:val="none"/>
         </w:rPr>
       </w:pPr>
+      <w:proofErr w:type="spellStart"/>
       <w:r>
         <w:rPr>
           <w:rFonts w:ascii="Times New Roman" w:eastAsia="Times New Roman" w:hAnsi="Times New Roman" w:cs="Times New Roman"/>
@@ -29,7 +30,21 @@
           <w:lang w:eastAsia="en-IN" w:bidi="ar-SA"/>
           <w14:ligatures w14:val="none"/>
         </w:rPr>
-        <w:t>CheckMate Development Roadmap</w:t>
+        <w:t>CheckMate</w:t>
+      </w:r>
+      <w:proofErr w:type="spellEnd"/>
+      <w:r>
+        <w:rPr>
+          <w:rFonts w:ascii="Times New Roman" w:eastAsia="Times New Roman" w:hAnsi="Times New Roman" w:cs="Times New Roman"/>
+          <w:b/>
+          <w:bCs/>
+          <w:kern w:val="36"/>
+          <w:sz w:val="48"/>
+          <w:szCs w:val="48"/>
+          <w:lang w:eastAsia="en-IN" w:bidi="ar-SA"/>
+          <w14:ligatures w14:val="none"/>
+        </w:rPr>
+        <w:t xml:space="preserve"> Development Roadmap</w:t>
       </w:r>
     </w:p>
     <w:p>
@@ -790,7 +805,27 @@
           <w:lang w:eastAsia="en-IN" w:bidi="ar-SA"/>
           <w14:ligatures w14:val="none"/>
         </w:rPr>
-        <w:t xml:space="preserve"> CheckMate appears in Blender without errors.</w:t>
+        <w:t xml:space="preserve"> </w:t>
+      </w:r>
+      <w:proofErr w:type="spellStart"/>
+      <w:r>
+        <w:rPr>
+          <w:rFonts w:ascii="Times New Roman" w:eastAsia="Times New Roman" w:hAnsi="Times New Roman" w:cs="Times New Roman"/>
+          <w:kern w:val="0"/>
+          <w:lang w:eastAsia="en-IN" w:bidi="ar-SA"/>
+          <w14:ligatures w14:val="none"/>
+        </w:rPr>
+        <w:t>CheckMate</w:t>
+      </w:r>
+      <w:proofErr w:type="spellEnd"/>
+      <w:r>
+        <w:rPr>
+          <w:rFonts w:ascii="Times New Roman" w:eastAsia="Times New Roman" w:hAnsi="Times New Roman" w:cs="Times New Roman"/>
+          <w:kern w:val="0"/>
+          <w:lang w:eastAsia="en-IN" w:bidi="ar-SA"/>
+          <w14:ligatures w14:val="none"/>
+        </w:rPr>
+        <w:t xml:space="preserve"> appears in Blender without errors.</w:t>
       </w:r>
     </w:p>
     <w:p>
@@ -991,7 +1026,27 @@
           <w:lang w:eastAsia="en-IN" w:bidi="ar-SA"/>
           <w14:ligatures w14:val="none"/>
         </w:rPr>
-        <w:t>Add CheckMate header.</w:t>
+        <w:t xml:space="preserve">Add </w:t>
+      </w:r>
+      <w:proofErr w:type="spellStart"/>
+      <w:r>
+        <w:rPr>
+          <w:rFonts w:ascii="Times New Roman" w:eastAsia="Times New Roman" w:hAnsi="Times New Roman" w:cs="Times New Roman"/>
+          <w:kern w:val="0"/>
+          <w:lang w:eastAsia="en-IN" w:bidi="ar-SA"/>
+          <w14:ligatures w14:val="none"/>
+        </w:rPr>
+        <w:t>CheckMate</w:t>
+      </w:r>
+      <w:proofErr w:type="spellEnd"/>
+      <w:r>
+        <w:rPr>
+          <w:rFonts w:ascii="Times New Roman" w:eastAsia="Times New Roman" w:hAnsi="Times New Roman" w:cs="Times New Roman"/>
+          <w:kern w:val="0"/>
+          <w:lang w:eastAsia="en-IN" w:bidi="ar-SA"/>
+          <w14:ligatures w14:val="none"/>
+        </w:rPr>
+        <w:t xml:space="preserve"> header.</w:t>
       </w:r>
     </w:p>
     <w:p>
@@ -1391,7 +1446,27 @@
           <w:lang w:eastAsia="en-IN" w:bidi="ar-SA"/>
           <w14:ligatures w14:val="none"/>
         </w:rPr>
-        <w:t>Create ValidationEngine.</w:t>
+        <w:t xml:space="preserve">Create </w:t>
+      </w:r>
+      <w:proofErr w:type="spellStart"/>
+      <w:r>
+        <w:rPr>
+          <w:rFonts w:ascii="Times New Roman" w:eastAsia="Times New Roman" w:hAnsi="Times New Roman" w:cs="Times New Roman"/>
+          <w:kern w:val="0"/>
+          <w:lang w:eastAsia="en-IN" w:bidi="ar-SA"/>
+          <w14:ligatures w14:val="none"/>
+        </w:rPr>
+        <w:t>ValidationEngine</w:t>
+      </w:r>
+      <w:proofErr w:type="spellEnd"/>
+      <w:r>
+        <w:rPr>
+          <w:rFonts w:ascii="Times New Roman" w:eastAsia="Times New Roman" w:hAnsi="Times New Roman" w:cs="Times New Roman"/>
+          <w:kern w:val="0"/>
+          <w:lang w:eastAsia="en-IN" w:bidi="ar-SA"/>
+          <w14:ligatures w14:val="none"/>
+        </w:rPr>
+        <w:t>.</w:t>
       </w:r>
     </w:p>
     <w:p>
@@ -1629,7 +1704,7 @@
           <w:lang w:eastAsia="en-IN" w:bidi="ar-SA"/>
           <w14:ligatures w14:val="none"/>
         </w:rPr>
-        <w:t>-</w:t>
+        <w:t>–</w:t>
       </w:r>
       <w:r>
         <w:rPr>
@@ -1642,7 +1717,20 @@
           <w:lang w:eastAsia="en-IN" w:bidi="ar-SA"/>
           <w14:ligatures w14:val="none"/>
         </w:rPr>
-        <w:t xml:space="preserve"> Validation Modules</w:t>
+        <w:t xml:space="preserve"> </w:t>
+      </w:r>
+      <w:r>
+        <w:rPr>
+          <w:rFonts w:ascii="Times New Roman" w:eastAsia="Times New Roman" w:hAnsi="Times New Roman" w:cs="Times New Roman"/>
+          <w:b/>
+          <w:bCs/>
+          <w:kern w:val="36"/>
+          <w:sz w:val="40"/>
+          <w:szCs w:val="40"/>
+          <w:lang w:eastAsia="en-IN" w:bidi="ar-SA"/>
+          <w14:ligatures w14:val="none"/>
+        </w:rPr>
+        <w:t>Core Validation Rules</w:t>
       </w:r>
     </w:p>
     <w:p>
@@ -3033,13 +3121,7 @@
         <w:rPr>
           <w:rFonts w:ascii="Cambria Math" w:hAnsi="Cambria Math" w:cs="Cambria Math"/>
         </w:rPr>
-        <w:t>▷▷</w:t>
-      </w:r>
-      <w:r>
-        <w:rPr>
-          <w:rFonts w:ascii="Cambria Math" w:hAnsi="Cambria Math" w:cs="Cambria Math"/>
-        </w:rPr>
-        <w:t xml:space="preserve"> </w:t>
+        <w:t xml:space="preserve">▷▷ </w:t>
       </w:r>
       <w:r>
         <w:rPr>
@@ -3556,13 +3638,7 @@
         <w:rPr>
           <w:rFonts w:ascii="Cambria Math" w:hAnsi="Cambria Math" w:cs="Cambria Math"/>
         </w:rPr>
-        <w:t>▷▷</w:t>
-      </w:r>
-      <w:r>
-        <w:rPr>
-          <w:rFonts w:ascii="Cambria Math" w:hAnsi="Cambria Math" w:cs="Cambria Math"/>
-        </w:rPr>
-        <w:t xml:space="preserve"> </w:t>
+        <w:t xml:space="preserve">▷▷ </w:t>
       </w:r>
       <w:r>
         <w:rPr>
@@ -4324,7 +4400,27 @@
           <w:lang w:eastAsia="en-IN" w:bidi="ar-SA"/>
           <w14:ligatures w14:val="none"/>
         </w:rPr>
-        <w:t xml:space="preserve"> CheckMate Version 1 Released.</w:t>
+        <w:t xml:space="preserve"> </w:t>
+      </w:r>
+      <w:proofErr w:type="spellStart"/>
+      <w:r>
+        <w:rPr>
+          <w:rFonts w:ascii="Times New Roman" w:eastAsia="Times New Roman" w:hAnsi="Times New Roman" w:cs="Times New Roman"/>
+          <w:kern w:val="0"/>
+          <w:lang w:eastAsia="en-IN" w:bidi="ar-SA"/>
+          <w14:ligatures w14:val="none"/>
+        </w:rPr>
+        <w:t>CheckMate</w:t>
+      </w:r>
+      <w:proofErr w:type="spellEnd"/>
+      <w:r>
+        <w:rPr>
+          <w:rFonts w:ascii="Times New Roman" w:eastAsia="Times New Roman" w:hAnsi="Times New Roman" w:cs="Times New Roman"/>
+          <w:kern w:val="0"/>
+          <w:lang w:eastAsia="en-IN" w:bidi="ar-SA"/>
+          <w14:ligatures w14:val="none"/>
+        </w:rPr>
+        <w:t xml:space="preserve"> Version 1 Released.</w:t>
       </w:r>
     </w:p>
     <w:p>
@@ -9583,6 +9679,7 @@
   <w:style w:type="character" w:default="1" w:styleId="DefaultParagraphFont">
     <w:name w:val="Default Paragraph Font"/>
     <w:uiPriority w:val="1"/>
+    <w:semiHidden/>
     <w:unhideWhenUsed/>
   </w:style>
   <w:style w:type="table" w:default="1" w:styleId="TableNormal">

</xml_diff>